<commit_message>
perbaiki template temuan negatif
</commit_message>
<xml_diff>
--- a/storage/app/public/template/template_ptk.docx
+++ b/storage/app/public/template/template_ptk.docx
@@ -1188,829 +1188,6 @@
     </w:p>
     <w:tbl>
       <w:tblPr>
-        <w:tblStyle w:val="TableGrid"/>
-        <w:tblW w:w="10102" w:type="dxa"/>
-        <w:tblInd w:w="-431" w:type="dxa"/>
-        <w:tblLook w:val="04A0" w:firstRow="1" w:lastRow="0" w:firstColumn="1" w:lastColumn="0" w:noHBand="0" w:noVBand="1"/>
-      </w:tblPr>
-      <w:tblGrid>
-        <w:gridCol w:w="4241"/>
-        <w:gridCol w:w="3108"/>
-        <w:gridCol w:w="2753"/>
-      </w:tblGrid>
-      <w:tr>
-        <w:tc>
-          <w:tcPr>
-            <w:tcW w:w="10102" w:type="dxa"/>
-            <w:gridSpan w:val="3"/>
-            <w:tcBorders>
-              <w:bottom w:val="single" w:sz="4" w:space="0" w:color="auto"/>
-            </w:tcBorders>
-            <w:shd w:val="clear" w:color="auto" w:fill="BDD6EE" w:themeFill="accent1" w:themeFillTint="66"/>
-          </w:tcPr>
-          <w:p>
-            <w:pPr>
-              <w:rPr>
-                <w:rFonts w:ascii="Arial" w:hAnsi="Arial" w:cs="Arial"/>
-                <w:sz w:val="20"/>
-                <w:szCs w:val="20"/>
-                <w:lang w:val="fi-FI"/>
-              </w:rPr>
-            </w:pPr>
-            <w:r>
-              <w:rPr>
-                <w:rFonts w:ascii="Arial" w:hAnsi="Arial" w:cs="Arial"/>
-                <w:sz w:val="20"/>
-                <w:szCs w:val="20"/>
-                <w:lang w:val="fi-FI"/>
-              </w:rPr>
-              <w:t xml:space="preserve">Deskripsi / Uraian Temuan </w:t>
-            </w:r>
-            <w:r>
-              <w:rPr>
-                <w:rFonts w:ascii="Arial" w:hAnsi="Arial" w:cs="Arial"/>
-                <w:i/>
-                <w:sz w:val="20"/>
-                <w:szCs w:val="20"/>
-                <w:lang w:val="fi-FI"/>
-              </w:rPr>
-              <w:t>(diisi oleh Auditor)</w:t>
-            </w:r>
-          </w:p>
-        </w:tc>
-      </w:tr>
-      <w:tr>
-        <w:trPr>
-          <w:trHeight w:val="57"/>
-        </w:trPr>
-        <w:tc>
-          <w:tcPr>
-            <w:tcW w:w="10102" w:type="dxa"/>
-            <w:gridSpan w:val="3"/>
-            <w:tcBorders>
-              <w:top w:val="single" w:sz="4" w:space="0" w:color="auto"/>
-              <w:bottom w:val="nil"/>
-            </w:tcBorders>
-            <w:shd w:val="clear" w:color="auto" w:fill="auto"/>
-            <w:vAlign w:val="center"/>
-          </w:tcPr>
-          <w:p>
-            <w:pPr>
-              <w:spacing w:line="276" w:lineRule="auto"/>
-              <w:rPr>
-                <w:rFonts w:ascii="Arial" w:hAnsi="Arial" w:cs="Arial"/>
-                <w:sz w:val="2"/>
-                <w:szCs w:val="2"/>
-                <w:lang w:val="fi-FI"/>
-              </w:rPr>
-            </w:pPr>
-          </w:p>
-        </w:tc>
-      </w:tr>
-      <w:tr>
-        <w:trPr>
-          <w:trHeight w:val="340"/>
-        </w:trPr>
-        <w:tc>
-          <w:tcPr>
-            <w:tcW w:w="10102" w:type="dxa"/>
-            <w:gridSpan w:val="3"/>
-            <w:tcBorders>
-              <w:top w:val="nil"/>
-              <w:bottom w:val="nil"/>
-            </w:tcBorders>
-            <w:shd w:val="clear" w:color="auto" w:fill="auto"/>
-            <w:vAlign w:val="center"/>
-          </w:tcPr>
-          <w:p>
-            <w:pPr>
-              <w:spacing w:line="276" w:lineRule="auto"/>
-              <w:rPr>
-                <w:rFonts w:ascii="Arial" w:hAnsi="Arial" w:cs="Arial"/>
-                <w:sz w:val="20"/>
-                <w:szCs w:val="20"/>
-                <w:lang w:val="fi-FI"/>
-              </w:rPr>
-            </w:pPr>
-            <w:r>
-              <w:rPr>
-                <w:rFonts w:ascii="Arial" w:hAnsi="Arial" w:cs="Arial"/>
-                <w:sz w:val="20"/>
-                <w:szCs w:val="20"/>
-                <w:lang w:val="fi-FI"/>
-              </w:rPr>
-              <w:t>${no</w:t>
-            </w:r>
-            <w:r>
-              <w:rPr>
-                <w:rFonts w:ascii="Arial" w:hAnsi="Arial" w:cs="Arial"/>
-                <w:sz w:val="20"/>
-                <w:szCs w:val="20"/>
-                <w:lang w:val="fi-FI"/>
-              </w:rPr>
-              <w:t>Deskripsi</w:t>
-            </w:r>
-            <w:r>
-              <w:rPr>
-                <w:rFonts w:ascii="Arial" w:hAnsi="Arial" w:cs="Arial"/>
-                <w:sz w:val="20"/>
-                <w:szCs w:val="20"/>
-                <w:lang w:val="fi-FI"/>
-              </w:rPr>
-              <w:t>}</w:t>
-            </w:r>
-            <w:r>
-              <w:rPr>
-                <w:rFonts w:ascii="Arial" w:hAnsi="Arial" w:cs="Arial"/>
-                <w:sz w:val="20"/>
-                <w:szCs w:val="20"/>
-                <w:lang w:val="fi-FI"/>
-              </w:rPr>
-              <w:t>${kodeDeskripsi}</w:t>
-            </w:r>
-          </w:p>
-          <w:p>
-            <w:pPr>
-              <w:spacing w:line="276" w:lineRule="auto"/>
-              <w:rPr>
-                <w:rFonts w:ascii="Arial" w:hAnsi="Arial" w:cs="Arial"/>
-                <w:sz w:val="20"/>
-                <w:szCs w:val="20"/>
-                <w:lang w:val="fi-FI"/>
-              </w:rPr>
-            </w:pPr>
-            <w:r>
-              <w:rPr>
-                <w:rFonts w:ascii="Arial" w:hAnsi="Arial" w:cs="Arial"/>
-                <w:sz w:val="20"/>
-                <w:szCs w:val="20"/>
-                <w:lang w:val="fi-FI"/>
-              </w:rPr>
-              <w:t>${deskripsi}</w:t>
-            </w:r>
-          </w:p>
-        </w:tc>
-      </w:tr>
-      <w:tr>
-        <w:trPr>
-          <w:trHeight w:val="20"/>
-        </w:trPr>
-        <w:tc>
-          <w:tcPr>
-            <w:tcW w:w="10102" w:type="dxa"/>
-            <w:gridSpan w:val="3"/>
-            <w:tcBorders>
-              <w:top w:val="nil"/>
-              <w:bottom w:val="single" w:sz="4" w:space="0" w:color="auto"/>
-            </w:tcBorders>
-            <w:shd w:val="clear" w:color="auto" w:fill="auto"/>
-            <w:vAlign w:val="center"/>
-          </w:tcPr>
-          <w:p>
-            <w:pPr>
-              <w:spacing w:line="276" w:lineRule="auto"/>
-              <w:rPr>
-                <w:rFonts w:ascii="Arial" w:hAnsi="Arial" w:cs="Arial"/>
-                <w:sz w:val="2"/>
-                <w:szCs w:val="2"/>
-                <w:lang w:val="fi-FI"/>
-              </w:rPr>
-            </w:pPr>
-          </w:p>
-        </w:tc>
-      </w:tr>
-      <w:tr>
-        <w:tc>
-          <w:tcPr>
-            <w:tcW w:w="10102" w:type="dxa"/>
-            <w:gridSpan w:val="3"/>
-            <w:tcBorders>
-              <w:top w:val="single" w:sz="4" w:space="0" w:color="auto"/>
-              <w:bottom w:val="single" w:sz="4" w:space="0" w:color="auto"/>
-            </w:tcBorders>
-            <w:shd w:val="clear" w:color="auto" w:fill="BDD6EE" w:themeFill="accent1" w:themeFillTint="66"/>
-          </w:tcPr>
-          <w:p>
-            <w:pPr>
-              <w:rPr>
-                <w:rFonts w:ascii="Arial" w:hAnsi="Arial" w:cs="Arial"/>
-                <w:sz w:val="20"/>
-                <w:szCs w:val="20"/>
-              </w:rPr>
-            </w:pPr>
-            <w:proofErr w:type="spellStart"/>
-            <w:r>
-              <w:rPr>
-                <w:rFonts w:ascii="Arial" w:hAnsi="Arial" w:cs="Arial"/>
-                <w:sz w:val="20"/>
-                <w:szCs w:val="20"/>
-              </w:rPr>
-              <w:t>Analisis</w:t>
-            </w:r>
-            <w:proofErr w:type="spellEnd"/>
-            <w:r>
-              <w:rPr>
-                <w:rFonts w:ascii="Arial" w:hAnsi="Arial" w:cs="Arial"/>
-                <w:sz w:val="20"/>
-                <w:szCs w:val="20"/>
-              </w:rPr>
-              <w:t xml:space="preserve"> </w:t>
-            </w:r>
-            <w:proofErr w:type="spellStart"/>
-            <w:r>
-              <w:rPr>
-                <w:rFonts w:ascii="Arial" w:hAnsi="Arial" w:cs="Arial"/>
-                <w:sz w:val="20"/>
-                <w:szCs w:val="20"/>
-              </w:rPr>
-              <w:t>Penyebab</w:t>
-            </w:r>
-            <w:proofErr w:type="spellEnd"/>
-          </w:p>
-        </w:tc>
-      </w:tr>
-      <w:tr>
-        <w:trPr>
-          <w:trHeight w:val="20"/>
-        </w:trPr>
-        <w:tc>
-          <w:tcPr>
-            <w:tcW w:w="10102" w:type="dxa"/>
-            <w:gridSpan w:val="3"/>
-            <w:tcBorders>
-              <w:top w:val="single" w:sz="4" w:space="0" w:color="auto"/>
-              <w:bottom w:val="nil"/>
-            </w:tcBorders>
-            <w:shd w:val="clear" w:color="auto" w:fill="auto"/>
-            <w:vAlign w:val="center"/>
-          </w:tcPr>
-          <w:p>
-            <w:pPr>
-              <w:rPr>
-                <w:rFonts w:ascii="Arial" w:hAnsi="Arial" w:cs="Arial"/>
-                <w:sz w:val="2"/>
-                <w:szCs w:val="2"/>
-                <w:lang w:val="fi-FI"/>
-              </w:rPr>
-            </w:pPr>
-          </w:p>
-        </w:tc>
-      </w:tr>
-      <w:tr>
-        <w:trPr>
-          <w:trHeight w:val="340"/>
-        </w:trPr>
-        <w:tc>
-          <w:tcPr>
-            <w:tcW w:w="10102" w:type="dxa"/>
-            <w:gridSpan w:val="3"/>
-            <w:tcBorders>
-              <w:top w:val="nil"/>
-              <w:bottom w:val="nil"/>
-            </w:tcBorders>
-            <w:shd w:val="clear" w:color="auto" w:fill="auto"/>
-            <w:vAlign w:val="center"/>
-          </w:tcPr>
-          <w:p>
-            <w:pPr>
-              <w:rPr>
-                <w:rFonts w:ascii="Arial" w:hAnsi="Arial" w:cs="Arial"/>
-                <w:sz w:val="20"/>
-                <w:szCs w:val="20"/>
-                <w:lang w:val="fi-FI"/>
-              </w:rPr>
-            </w:pPr>
-            <w:r>
-              <w:rPr>
-                <w:rFonts w:ascii="Arial" w:hAnsi="Arial" w:cs="Arial"/>
-                <w:sz w:val="20"/>
-                <w:szCs w:val="20"/>
-                <w:lang w:val="fi-FI"/>
-              </w:rPr>
-              <w:t>${noAnalisis}</w:t>
-            </w:r>
-            <w:r>
-              <w:rPr>
-                <w:rFonts w:ascii="Arial" w:hAnsi="Arial" w:cs="Arial"/>
-                <w:sz w:val="20"/>
-                <w:szCs w:val="20"/>
-                <w:lang w:val="fi-FI"/>
-              </w:rPr>
-              <w:t>${kode</w:t>
-            </w:r>
-            <w:r>
-              <w:rPr>
-                <w:rFonts w:ascii="Arial" w:hAnsi="Arial" w:cs="Arial"/>
-                <w:sz w:val="20"/>
-                <w:szCs w:val="20"/>
-                <w:lang w:val="fi-FI"/>
-              </w:rPr>
-              <w:t>Analisis</w:t>
-            </w:r>
-            <w:r>
-              <w:rPr>
-                <w:rFonts w:ascii="Arial" w:hAnsi="Arial" w:cs="Arial"/>
-                <w:sz w:val="20"/>
-                <w:szCs w:val="20"/>
-                <w:lang w:val="fi-FI"/>
-              </w:rPr>
-              <w:t>}</w:t>
-            </w:r>
-          </w:p>
-          <w:p>
-            <w:pPr>
-              <w:rPr>
-                <w:rFonts w:ascii="Arial" w:hAnsi="Arial" w:cs="Arial"/>
-                <w:sz w:val="20"/>
-                <w:szCs w:val="20"/>
-              </w:rPr>
-            </w:pPr>
-            <w:r>
-              <w:rPr>
-                <w:rFonts w:ascii="Arial" w:hAnsi="Arial" w:cs="Arial"/>
-                <w:sz w:val="20"/>
-                <w:szCs w:val="20"/>
-              </w:rPr>
-              <w:t>${</w:t>
-            </w:r>
-            <w:proofErr w:type="spellStart"/>
-            <w:r>
-              <w:rPr>
-                <w:rFonts w:ascii="Arial" w:hAnsi="Arial" w:cs="Arial"/>
-                <w:sz w:val="20"/>
-                <w:szCs w:val="20"/>
-              </w:rPr>
-              <w:t>analisis</w:t>
-            </w:r>
-            <w:proofErr w:type="spellEnd"/>
-            <w:r>
-              <w:rPr>
-                <w:rFonts w:ascii="Arial" w:hAnsi="Arial" w:cs="Arial"/>
-                <w:sz w:val="20"/>
-                <w:szCs w:val="20"/>
-              </w:rPr>
-              <w:t>}</w:t>
-            </w:r>
-          </w:p>
-        </w:tc>
-      </w:tr>
-      <w:tr>
-        <w:trPr>
-          <w:trHeight w:val="20"/>
-        </w:trPr>
-        <w:tc>
-          <w:tcPr>
-            <w:tcW w:w="10102" w:type="dxa"/>
-            <w:gridSpan w:val="3"/>
-            <w:tcBorders>
-              <w:top w:val="nil"/>
-              <w:bottom w:val="single" w:sz="4" w:space="0" w:color="auto"/>
-            </w:tcBorders>
-            <w:shd w:val="clear" w:color="auto" w:fill="auto"/>
-            <w:vAlign w:val="center"/>
-          </w:tcPr>
-          <w:p>
-            <w:pPr>
-              <w:rPr>
-                <w:rFonts w:ascii="Arial" w:hAnsi="Arial" w:cs="Arial"/>
-                <w:sz w:val="2"/>
-                <w:szCs w:val="2"/>
-                <w:lang w:val="fi-FI"/>
-              </w:rPr>
-            </w:pPr>
-          </w:p>
-        </w:tc>
-      </w:tr>
-      <w:tr>
-        <w:tc>
-          <w:tcPr>
-            <w:tcW w:w="10102" w:type="dxa"/>
-            <w:gridSpan w:val="3"/>
-            <w:tcBorders>
-              <w:top w:val="single" w:sz="4" w:space="0" w:color="auto"/>
-              <w:bottom w:val="single" w:sz="4" w:space="0" w:color="auto"/>
-            </w:tcBorders>
-            <w:shd w:val="clear" w:color="auto" w:fill="BDD6EE" w:themeFill="accent1" w:themeFillTint="66"/>
-          </w:tcPr>
-          <w:p>
-            <w:pPr>
-              <w:rPr>
-                <w:rFonts w:ascii="Arial" w:hAnsi="Arial" w:cs="Arial"/>
-                <w:sz w:val="20"/>
-                <w:szCs w:val="20"/>
-              </w:rPr>
-            </w:pPr>
-            <w:proofErr w:type="spellStart"/>
-            <w:r>
-              <w:rPr>
-                <w:rFonts w:ascii="Arial" w:hAnsi="Arial" w:cs="Arial"/>
-                <w:sz w:val="20"/>
-                <w:szCs w:val="20"/>
-              </w:rPr>
-              <w:t>Akibat</w:t>
-            </w:r>
-            <w:proofErr w:type="spellEnd"/>
-            <w:r>
-              <w:rPr>
-                <w:rFonts w:ascii="Arial" w:hAnsi="Arial" w:cs="Arial"/>
-                <w:sz w:val="20"/>
-                <w:szCs w:val="20"/>
-              </w:rPr>
-              <w:t xml:space="preserve"> </w:t>
-            </w:r>
-          </w:p>
-        </w:tc>
-      </w:tr>
-      <w:tr>
-        <w:trPr>
-          <w:trHeight w:val="20"/>
-        </w:trPr>
-        <w:tc>
-          <w:tcPr>
-            <w:tcW w:w="10102" w:type="dxa"/>
-            <w:gridSpan w:val="3"/>
-            <w:tcBorders>
-              <w:top w:val="single" w:sz="4" w:space="0" w:color="auto"/>
-              <w:bottom w:val="nil"/>
-            </w:tcBorders>
-            <w:shd w:val="clear" w:color="auto" w:fill="auto"/>
-            <w:vAlign w:val="center"/>
-          </w:tcPr>
-          <w:p>
-            <w:pPr>
-              <w:rPr>
-                <w:rFonts w:ascii="Arial" w:hAnsi="Arial" w:cs="Arial"/>
-                <w:sz w:val="2"/>
-                <w:szCs w:val="2"/>
-                <w:lang w:val="fi-FI"/>
-              </w:rPr>
-            </w:pPr>
-          </w:p>
-        </w:tc>
-      </w:tr>
-      <w:tr>
-        <w:trPr>
-          <w:trHeight w:val="340"/>
-        </w:trPr>
-        <w:tc>
-          <w:tcPr>
-            <w:tcW w:w="10102" w:type="dxa"/>
-            <w:gridSpan w:val="3"/>
-            <w:tcBorders>
-              <w:top w:val="nil"/>
-              <w:bottom w:val="nil"/>
-            </w:tcBorders>
-            <w:shd w:val="clear" w:color="auto" w:fill="auto"/>
-            <w:vAlign w:val="center"/>
-          </w:tcPr>
-          <w:p>
-            <w:pPr>
-              <w:rPr>
-                <w:rFonts w:ascii="Arial" w:hAnsi="Arial" w:cs="Arial"/>
-                <w:sz w:val="20"/>
-                <w:szCs w:val="20"/>
-                <w:lang w:val="fi-FI"/>
-              </w:rPr>
-            </w:pPr>
-            <w:r>
-              <w:rPr>
-                <w:rFonts w:ascii="Arial" w:hAnsi="Arial" w:cs="Arial"/>
-                <w:sz w:val="20"/>
-                <w:szCs w:val="20"/>
-                <w:lang w:val="fi-FI"/>
-              </w:rPr>
-              <w:t>${noAkibat}</w:t>
-            </w:r>
-            <w:r>
-              <w:rPr>
-                <w:rFonts w:ascii="Arial" w:hAnsi="Arial" w:cs="Arial"/>
-                <w:sz w:val="20"/>
-                <w:szCs w:val="20"/>
-                <w:lang w:val="fi-FI"/>
-              </w:rPr>
-              <w:t>${kode</w:t>
-            </w:r>
-            <w:r>
-              <w:rPr>
-                <w:rFonts w:ascii="Arial" w:hAnsi="Arial" w:cs="Arial"/>
-                <w:sz w:val="20"/>
-                <w:szCs w:val="20"/>
-                <w:lang w:val="fi-FI"/>
-              </w:rPr>
-              <w:t>Akibat</w:t>
-            </w:r>
-            <w:r>
-              <w:rPr>
-                <w:rFonts w:ascii="Arial" w:hAnsi="Arial" w:cs="Arial"/>
-                <w:sz w:val="20"/>
-                <w:szCs w:val="20"/>
-                <w:lang w:val="fi-FI"/>
-              </w:rPr>
-              <w:t>}</w:t>
-            </w:r>
-          </w:p>
-          <w:p>
-            <w:pPr>
-              <w:rPr>
-                <w:rFonts w:ascii="Arial" w:hAnsi="Arial" w:cs="Arial"/>
-                <w:sz w:val="20"/>
-                <w:szCs w:val="20"/>
-              </w:rPr>
-            </w:pPr>
-            <w:r>
-              <w:rPr>
-                <w:rFonts w:ascii="Arial" w:hAnsi="Arial" w:cs="Arial"/>
-                <w:sz w:val="20"/>
-                <w:szCs w:val="20"/>
-              </w:rPr>
-              <w:t>${</w:t>
-            </w:r>
-            <w:proofErr w:type="spellStart"/>
-            <w:r>
-              <w:rPr>
-                <w:rFonts w:ascii="Arial" w:hAnsi="Arial" w:cs="Arial"/>
-                <w:sz w:val="20"/>
-                <w:szCs w:val="20"/>
-              </w:rPr>
-              <w:t>akibat</w:t>
-            </w:r>
-            <w:proofErr w:type="spellEnd"/>
-            <w:r>
-              <w:rPr>
-                <w:rFonts w:ascii="Arial" w:hAnsi="Arial" w:cs="Arial"/>
-                <w:sz w:val="20"/>
-                <w:szCs w:val="20"/>
-              </w:rPr>
-              <w:t>}</w:t>
-            </w:r>
-          </w:p>
-        </w:tc>
-      </w:tr>
-      <w:tr>
-        <w:trPr>
-          <w:trHeight w:val="20"/>
-        </w:trPr>
-        <w:tc>
-          <w:tcPr>
-            <w:tcW w:w="10102" w:type="dxa"/>
-            <w:gridSpan w:val="3"/>
-            <w:tcBorders>
-              <w:top w:val="nil"/>
-              <w:bottom w:val="single" w:sz="4" w:space="0" w:color="auto"/>
-            </w:tcBorders>
-            <w:shd w:val="clear" w:color="auto" w:fill="auto"/>
-            <w:vAlign w:val="center"/>
-          </w:tcPr>
-          <w:p>
-            <w:pPr>
-              <w:rPr>
-                <w:rFonts w:ascii="Arial" w:hAnsi="Arial" w:cs="Arial"/>
-                <w:sz w:val="2"/>
-                <w:szCs w:val="2"/>
-                <w:lang w:val="fi-FI"/>
-              </w:rPr>
-            </w:pPr>
-          </w:p>
-        </w:tc>
-      </w:tr>
-      <w:tr>
-        <w:tc>
-          <w:tcPr>
-            <w:tcW w:w="4241" w:type="dxa"/>
-            <w:tcBorders>
-              <w:top w:val="single" w:sz="4" w:space="0" w:color="auto"/>
-            </w:tcBorders>
-            <w:shd w:val="clear" w:color="auto" w:fill="BDD6EE" w:themeFill="accent1" w:themeFillTint="66"/>
-          </w:tcPr>
-          <w:p>
-            <w:pPr>
-              <w:rPr>
-                <w:rFonts w:ascii="Arial" w:hAnsi="Arial" w:cs="Arial"/>
-                <w:sz w:val="20"/>
-                <w:szCs w:val="20"/>
-              </w:rPr>
-            </w:pPr>
-            <w:proofErr w:type="spellStart"/>
-            <w:r>
-              <w:rPr>
-                <w:rFonts w:ascii="Arial" w:hAnsi="Arial" w:cs="Arial"/>
-                <w:sz w:val="20"/>
-                <w:szCs w:val="20"/>
-              </w:rPr>
-              <w:t>Ketua</w:t>
-            </w:r>
-            <w:proofErr w:type="spellEnd"/>
-            <w:r>
-              <w:rPr>
-                <w:rFonts w:ascii="Arial" w:hAnsi="Arial" w:cs="Arial"/>
-                <w:sz w:val="20"/>
-                <w:szCs w:val="20"/>
-              </w:rPr>
-              <w:t xml:space="preserve"> Auditor</w:t>
-            </w:r>
-          </w:p>
-        </w:tc>
-        <w:tc>
-          <w:tcPr>
-            <w:tcW w:w="3108" w:type="dxa"/>
-            <w:tcBorders>
-              <w:top w:val="single" w:sz="4" w:space="0" w:color="auto"/>
-            </w:tcBorders>
-            <w:shd w:val="clear" w:color="auto" w:fill="BDD6EE" w:themeFill="accent1" w:themeFillTint="66"/>
-          </w:tcPr>
-          <w:p>
-            <w:pPr>
-              <w:rPr>
-                <w:rFonts w:ascii="Arial" w:hAnsi="Arial" w:cs="Arial"/>
-                <w:sz w:val="20"/>
-                <w:szCs w:val="20"/>
-              </w:rPr>
-            </w:pPr>
-            <w:r>
-              <w:rPr>
-                <w:rFonts w:ascii="Arial" w:hAnsi="Arial" w:cs="Arial"/>
-                <w:sz w:val="20"/>
-                <w:szCs w:val="20"/>
-              </w:rPr>
-              <w:t>Tanda Tangan</w:t>
-            </w:r>
-          </w:p>
-        </w:tc>
-        <w:tc>
-          <w:tcPr>
-            <w:tcW w:w="2753" w:type="dxa"/>
-            <w:tcBorders>
-              <w:top w:val="single" w:sz="4" w:space="0" w:color="auto"/>
-            </w:tcBorders>
-            <w:shd w:val="clear" w:color="auto" w:fill="BDD6EE" w:themeFill="accent1" w:themeFillTint="66"/>
-          </w:tcPr>
-          <w:p>
-            <w:pPr>
-              <w:rPr>
-                <w:rFonts w:ascii="Arial" w:hAnsi="Arial" w:cs="Arial"/>
-                <w:sz w:val="20"/>
-                <w:szCs w:val="20"/>
-              </w:rPr>
-            </w:pPr>
-            <w:proofErr w:type="spellStart"/>
-            <w:r>
-              <w:rPr>
-                <w:rFonts w:ascii="Arial" w:hAnsi="Arial" w:cs="Arial"/>
-                <w:sz w:val="20"/>
-                <w:szCs w:val="20"/>
-              </w:rPr>
-              <w:t>Tanggal</w:t>
-            </w:r>
-            <w:proofErr w:type="spellEnd"/>
-            <w:r>
-              <w:rPr>
-                <w:rFonts w:ascii="Arial" w:hAnsi="Arial" w:cs="Arial"/>
-                <w:sz w:val="20"/>
-                <w:szCs w:val="20"/>
-              </w:rPr>
-              <w:t xml:space="preserve"> Audit</w:t>
-            </w:r>
-          </w:p>
-        </w:tc>
-      </w:tr>
-      <w:tr>
-        <w:tc>
-          <w:tcPr>
-            <w:tcW w:w="4241" w:type="dxa"/>
-            <w:shd w:val="clear" w:color="auto" w:fill="auto"/>
-            <w:vAlign w:val="center"/>
-          </w:tcPr>
-          <w:p>
-            <w:pPr>
-              <w:jc w:val="center"/>
-              <w:rPr>
-                <w:rFonts w:ascii="Arial" w:hAnsi="Arial" w:cs="Arial"/>
-                <w:sz w:val="20"/>
-                <w:szCs w:val="20"/>
-              </w:rPr>
-            </w:pPr>
-          </w:p>
-          <w:p>
-            <w:pPr>
-              <w:jc w:val="center"/>
-              <w:rPr>
-                <w:rFonts w:ascii="Arial" w:hAnsi="Arial" w:cs="Arial"/>
-                <w:sz w:val="20"/>
-                <w:szCs w:val="20"/>
-              </w:rPr>
-            </w:pPr>
-            <w:r>
-              <w:rPr>
-                <w:rFonts w:ascii="Arial" w:hAnsi="Arial" w:cs="Arial"/>
-                <w:sz w:val="20"/>
-                <w:szCs w:val="20"/>
-              </w:rPr>
-              <w:t>${auditor#1}</w:t>
-            </w:r>
-          </w:p>
-          <w:p>
-            <w:pPr>
-              <w:jc w:val="center"/>
-              <w:rPr>
-                <w:rFonts w:ascii="Arial" w:hAnsi="Arial" w:cs="Arial"/>
-                <w:sz w:val="20"/>
-                <w:szCs w:val="20"/>
-              </w:rPr>
-            </w:pPr>
-          </w:p>
-        </w:tc>
-        <w:tc>
-          <w:tcPr>
-            <w:tcW w:w="3108" w:type="dxa"/>
-            <w:shd w:val="clear" w:color="auto" w:fill="auto"/>
-            <w:vAlign w:val="center"/>
-          </w:tcPr>
-          <w:p>
-            <w:pPr>
-              <w:jc w:val="center"/>
-              <w:rPr>
-                <w:rFonts w:ascii="Arial" w:hAnsi="Arial" w:cs="Arial"/>
-                <w:sz w:val="20"/>
-                <w:szCs w:val="20"/>
-              </w:rPr>
-            </w:pPr>
-            <w:r>
-              <w:rPr>
-                <w:rFonts w:ascii="Arial" w:hAnsi="Arial" w:cs="Arial"/>
-                <w:sz w:val="20"/>
-                <w:szCs w:val="20"/>
-              </w:rPr>
-              <w:t>${image</w:t>
-            </w:r>
-            <w:r>
-              <w:rPr>
-                <w:rFonts w:ascii="Arial" w:hAnsi="Arial" w:cs="Arial"/>
-                <w:sz w:val="20"/>
-                <w:szCs w:val="20"/>
-              </w:rPr>
-              <w:t>_auditor</w:t>
-            </w:r>
-            <w:r>
-              <w:rPr>
-                <w:rFonts w:ascii="Arial" w:hAnsi="Arial" w:cs="Arial"/>
-                <w:sz w:val="20"/>
-                <w:szCs w:val="20"/>
-              </w:rPr>
-              <w:t>#1}</w:t>
-            </w:r>
-          </w:p>
-        </w:tc>
-        <w:tc>
-          <w:tcPr>
-            <w:tcW w:w="2753" w:type="dxa"/>
-            <w:shd w:val="clear" w:color="auto" w:fill="auto"/>
-            <w:vAlign w:val="center"/>
-          </w:tcPr>
-          <w:p>
-            <w:pPr>
-              <w:jc w:val="center"/>
-              <w:rPr>
-                <w:rFonts w:ascii="Arial" w:hAnsi="Arial" w:cs="Arial"/>
-                <w:sz w:val="20"/>
-                <w:szCs w:val="20"/>
-              </w:rPr>
-            </w:pPr>
-          </w:p>
-          <w:p>
-            <w:pPr>
-              <w:jc w:val="center"/>
-              <w:rPr>
-                <w:rFonts w:ascii="Arial" w:hAnsi="Arial" w:cs="Arial"/>
-                <w:sz w:val="20"/>
-                <w:szCs w:val="20"/>
-              </w:rPr>
-            </w:pPr>
-            <w:r>
-              <w:rPr>
-                <w:rFonts w:ascii="Arial" w:hAnsi="Arial" w:cs="Arial"/>
-                <w:sz w:val="20"/>
-                <w:szCs w:val="20"/>
-              </w:rPr>
-              <w:t>${date}</w:t>
-            </w:r>
-          </w:p>
-        </w:tc>
-      </w:tr>
-    </w:tbl>
-    <w:p>
-      <w:pPr>
-        <w:spacing w:after="0" w:line="240" w:lineRule="auto"/>
-        <w:rPr>
-          <w:rFonts w:ascii="Arial" w:hAnsi="Arial" w:cs="Arial"/>
-          <w:b/>
-          <w:color w:val="002060"/>
-          <w:sz w:val="20"/>
-          <w:szCs w:val="20"/>
-        </w:rPr>
-      </w:pPr>
-    </w:p>
-    <w:tbl>
-      <w:tblPr>
         <w:tblW w:w="10065" w:type="dxa"/>
         <w:tblInd w:w="-431" w:type="dxa"/>
         <w:tblBorders>
@@ -2544,7 +1721,827 @@
     <w:p>
       <w:pPr>
         <w:spacing w:after="0" w:line="240" w:lineRule="auto"/>
-        <w:ind w:left="-426"/>
+        <w:rPr>
+          <w:rFonts w:ascii="Arial" w:hAnsi="Arial" w:cs="Arial"/>
+          <w:sz w:val="20"/>
+          <w:szCs w:val="20"/>
+        </w:rPr>
+      </w:pPr>
+    </w:p>
+    <w:tbl>
+      <w:tblPr>
+        <w:tblStyle w:val="TableGrid"/>
+        <w:tblW w:w="10102" w:type="dxa"/>
+        <w:tblInd w:w="-431" w:type="dxa"/>
+        <w:tblLook w:val="04A0" w:firstRow="1" w:lastRow="0" w:firstColumn="1" w:lastColumn="0" w:noHBand="0" w:noVBand="1"/>
+      </w:tblPr>
+      <w:tblGrid>
+        <w:gridCol w:w="4241"/>
+        <w:gridCol w:w="3108"/>
+        <w:gridCol w:w="2753"/>
+      </w:tblGrid>
+      <w:tr>
+        <w:tc>
+          <w:tcPr>
+            <w:tcW w:w="10102" w:type="dxa"/>
+            <w:gridSpan w:val="3"/>
+            <w:tcBorders>
+              <w:bottom w:val="single" w:sz="4" w:space="0" w:color="auto"/>
+            </w:tcBorders>
+            <w:shd w:val="clear" w:color="auto" w:fill="BDD6EE" w:themeFill="accent1" w:themeFillTint="66"/>
+          </w:tcPr>
+          <w:p>
+            <w:pPr>
+              <w:rPr>
+                <w:rFonts w:ascii="Arial" w:hAnsi="Arial" w:cs="Arial"/>
+                <w:sz w:val="20"/>
+                <w:szCs w:val="20"/>
+                <w:lang w:val="fi-FI"/>
+              </w:rPr>
+            </w:pPr>
+            <w:r>
+              <w:rPr>
+                <w:rFonts w:ascii="Arial" w:hAnsi="Arial" w:cs="Arial"/>
+                <w:sz w:val="20"/>
+                <w:szCs w:val="20"/>
+                <w:lang w:val="fi-FI"/>
+              </w:rPr>
+              <w:t xml:space="preserve">Deskripsi / Uraian Temuan </w:t>
+            </w:r>
+            <w:r>
+              <w:rPr>
+                <w:rFonts w:ascii="Arial" w:hAnsi="Arial" w:cs="Arial"/>
+                <w:i/>
+                <w:sz w:val="20"/>
+                <w:szCs w:val="20"/>
+                <w:lang w:val="fi-FI"/>
+              </w:rPr>
+              <w:t>(diisi oleh Auditor)</w:t>
+            </w:r>
+          </w:p>
+        </w:tc>
+      </w:tr>
+      <w:tr>
+        <w:trPr>
+          <w:trHeight w:val="57"/>
+        </w:trPr>
+        <w:tc>
+          <w:tcPr>
+            <w:tcW w:w="10102" w:type="dxa"/>
+            <w:gridSpan w:val="3"/>
+            <w:tcBorders>
+              <w:top w:val="single" w:sz="4" w:space="0" w:color="auto"/>
+              <w:bottom w:val="nil"/>
+            </w:tcBorders>
+            <w:shd w:val="clear" w:color="auto" w:fill="auto"/>
+            <w:vAlign w:val="center"/>
+          </w:tcPr>
+          <w:p>
+            <w:pPr>
+              <w:spacing w:line="276" w:lineRule="auto"/>
+              <w:rPr>
+                <w:rFonts w:ascii="Arial" w:hAnsi="Arial" w:cs="Arial"/>
+                <w:sz w:val="2"/>
+                <w:szCs w:val="2"/>
+                <w:lang w:val="fi-FI"/>
+              </w:rPr>
+            </w:pPr>
+          </w:p>
+        </w:tc>
+      </w:tr>
+      <w:tr>
+        <w:trPr>
+          <w:trHeight w:val="340"/>
+        </w:trPr>
+        <w:tc>
+          <w:tcPr>
+            <w:tcW w:w="10102" w:type="dxa"/>
+            <w:gridSpan w:val="3"/>
+            <w:tcBorders>
+              <w:top w:val="nil"/>
+              <w:bottom w:val="nil"/>
+            </w:tcBorders>
+            <w:shd w:val="clear" w:color="auto" w:fill="auto"/>
+            <w:vAlign w:val="center"/>
+          </w:tcPr>
+          <w:p>
+            <w:pPr>
+              <w:spacing w:line="276" w:lineRule="auto"/>
+              <w:rPr>
+                <w:rFonts w:ascii="Arial" w:hAnsi="Arial" w:cs="Arial"/>
+                <w:sz w:val="20"/>
+                <w:szCs w:val="20"/>
+                <w:lang w:val="fi-FI"/>
+              </w:rPr>
+            </w:pPr>
+            <w:r>
+              <w:rPr>
+                <w:rFonts w:ascii="Arial" w:hAnsi="Arial" w:cs="Arial"/>
+                <w:sz w:val="20"/>
+                <w:szCs w:val="20"/>
+                <w:lang w:val="fi-FI"/>
+              </w:rPr>
+              <w:t>${no</w:t>
+            </w:r>
+            <w:r>
+              <w:rPr>
+                <w:rFonts w:ascii="Arial" w:hAnsi="Arial" w:cs="Arial"/>
+                <w:sz w:val="20"/>
+                <w:szCs w:val="20"/>
+                <w:lang w:val="fi-FI"/>
+              </w:rPr>
+              <w:t>Deskripsi</w:t>
+            </w:r>
+            <w:r>
+              <w:rPr>
+                <w:rFonts w:ascii="Arial" w:hAnsi="Arial" w:cs="Arial"/>
+                <w:sz w:val="20"/>
+                <w:szCs w:val="20"/>
+                <w:lang w:val="fi-FI"/>
+              </w:rPr>
+              <w:t>}</w:t>
+            </w:r>
+            <w:r>
+              <w:rPr>
+                <w:rFonts w:ascii="Arial" w:hAnsi="Arial" w:cs="Arial"/>
+                <w:sz w:val="20"/>
+                <w:szCs w:val="20"/>
+                <w:lang w:val="fi-FI"/>
+              </w:rPr>
+              <w:t>${kodeDeskripsi}</w:t>
+            </w:r>
+          </w:p>
+          <w:p>
+            <w:pPr>
+              <w:spacing w:line="276" w:lineRule="auto"/>
+              <w:rPr>
+                <w:rFonts w:ascii="Arial" w:hAnsi="Arial" w:cs="Arial"/>
+                <w:sz w:val="20"/>
+                <w:szCs w:val="20"/>
+                <w:lang w:val="fi-FI"/>
+              </w:rPr>
+            </w:pPr>
+            <w:r>
+              <w:rPr>
+                <w:rFonts w:ascii="Arial" w:hAnsi="Arial" w:cs="Arial"/>
+                <w:sz w:val="20"/>
+                <w:szCs w:val="20"/>
+                <w:lang w:val="fi-FI"/>
+              </w:rPr>
+              <w:t>${deskripsi}</w:t>
+            </w:r>
+          </w:p>
+        </w:tc>
+      </w:tr>
+      <w:tr>
+        <w:trPr>
+          <w:trHeight w:val="20"/>
+        </w:trPr>
+        <w:tc>
+          <w:tcPr>
+            <w:tcW w:w="10102" w:type="dxa"/>
+            <w:gridSpan w:val="3"/>
+            <w:tcBorders>
+              <w:top w:val="nil"/>
+              <w:bottom w:val="single" w:sz="4" w:space="0" w:color="auto"/>
+            </w:tcBorders>
+            <w:shd w:val="clear" w:color="auto" w:fill="auto"/>
+            <w:vAlign w:val="center"/>
+          </w:tcPr>
+          <w:p>
+            <w:pPr>
+              <w:spacing w:line="276" w:lineRule="auto"/>
+              <w:rPr>
+                <w:rFonts w:ascii="Arial" w:hAnsi="Arial" w:cs="Arial"/>
+                <w:sz w:val="2"/>
+                <w:szCs w:val="2"/>
+                <w:lang w:val="fi-FI"/>
+              </w:rPr>
+            </w:pPr>
+          </w:p>
+        </w:tc>
+      </w:tr>
+      <w:tr>
+        <w:tc>
+          <w:tcPr>
+            <w:tcW w:w="10102" w:type="dxa"/>
+            <w:gridSpan w:val="3"/>
+            <w:tcBorders>
+              <w:top w:val="single" w:sz="4" w:space="0" w:color="auto"/>
+              <w:bottom w:val="single" w:sz="4" w:space="0" w:color="auto"/>
+            </w:tcBorders>
+            <w:shd w:val="clear" w:color="auto" w:fill="BDD6EE" w:themeFill="accent1" w:themeFillTint="66"/>
+          </w:tcPr>
+          <w:p>
+            <w:pPr>
+              <w:rPr>
+                <w:rFonts w:ascii="Arial" w:hAnsi="Arial" w:cs="Arial"/>
+                <w:sz w:val="20"/>
+                <w:szCs w:val="20"/>
+              </w:rPr>
+            </w:pPr>
+            <w:proofErr w:type="spellStart"/>
+            <w:r>
+              <w:rPr>
+                <w:rFonts w:ascii="Arial" w:hAnsi="Arial" w:cs="Arial"/>
+                <w:sz w:val="20"/>
+                <w:szCs w:val="20"/>
+              </w:rPr>
+              <w:t>Analisis</w:t>
+            </w:r>
+            <w:proofErr w:type="spellEnd"/>
+            <w:r>
+              <w:rPr>
+                <w:rFonts w:ascii="Arial" w:hAnsi="Arial" w:cs="Arial"/>
+                <w:sz w:val="20"/>
+                <w:szCs w:val="20"/>
+              </w:rPr>
+              <w:t xml:space="preserve"> </w:t>
+            </w:r>
+            <w:proofErr w:type="spellStart"/>
+            <w:r>
+              <w:rPr>
+                <w:rFonts w:ascii="Arial" w:hAnsi="Arial" w:cs="Arial"/>
+                <w:sz w:val="20"/>
+                <w:szCs w:val="20"/>
+              </w:rPr>
+              <w:t>Penyebab</w:t>
+            </w:r>
+            <w:proofErr w:type="spellEnd"/>
+          </w:p>
+        </w:tc>
+      </w:tr>
+      <w:tr>
+        <w:trPr>
+          <w:trHeight w:val="20"/>
+        </w:trPr>
+        <w:tc>
+          <w:tcPr>
+            <w:tcW w:w="10102" w:type="dxa"/>
+            <w:gridSpan w:val="3"/>
+            <w:tcBorders>
+              <w:top w:val="single" w:sz="4" w:space="0" w:color="auto"/>
+              <w:bottom w:val="nil"/>
+            </w:tcBorders>
+            <w:shd w:val="clear" w:color="auto" w:fill="auto"/>
+            <w:vAlign w:val="center"/>
+          </w:tcPr>
+          <w:p>
+            <w:pPr>
+              <w:rPr>
+                <w:rFonts w:ascii="Arial" w:hAnsi="Arial" w:cs="Arial"/>
+                <w:sz w:val="2"/>
+                <w:szCs w:val="2"/>
+                <w:lang w:val="fi-FI"/>
+              </w:rPr>
+            </w:pPr>
+          </w:p>
+        </w:tc>
+      </w:tr>
+      <w:tr>
+        <w:trPr>
+          <w:trHeight w:val="340"/>
+        </w:trPr>
+        <w:tc>
+          <w:tcPr>
+            <w:tcW w:w="10102" w:type="dxa"/>
+            <w:gridSpan w:val="3"/>
+            <w:tcBorders>
+              <w:top w:val="nil"/>
+              <w:bottom w:val="nil"/>
+            </w:tcBorders>
+            <w:shd w:val="clear" w:color="auto" w:fill="auto"/>
+            <w:vAlign w:val="center"/>
+          </w:tcPr>
+          <w:p>
+            <w:pPr>
+              <w:rPr>
+                <w:rFonts w:ascii="Arial" w:hAnsi="Arial" w:cs="Arial"/>
+                <w:sz w:val="20"/>
+                <w:szCs w:val="20"/>
+                <w:lang w:val="fi-FI"/>
+              </w:rPr>
+            </w:pPr>
+            <w:r>
+              <w:rPr>
+                <w:rFonts w:ascii="Arial" w:hAnsi="Arial" w:cs="Arial"/>
+                <w:sz w:val="20"/>
+                <w:szCs w:val="20"/>
+                <w:lang w:val="fi-FI"/>
+              </w:rPr>
+              <w:t>${noAnalisis}</w:t>
+            </w:r>
+            <w:r>
+              <w:rPr>
+                <w:rFonts w:ascii="Arial" w:hAnsi="Arial" w:cs="Arial"/>
+                <w:sz w:val="20"/>
+                <w:szCs w:val="20"/>
+                <w:lang w:val="fi-FI"/>
+              </w:rPr>
+              <w:t>${kode</w:t>
+            </w:r>
+            <w:r>
+              <w:rPr>
+                <w:rFonts w:ascii="Arial" w:hAnsi="Arial" w:cs="Arial"/>
+                <w:sz w:val="20"/>
+                <w:szCs w:val="20"/>
+                <w:lang w:val="fi-FI"/>
+              </w:rPr>
+              <w:t>Analisis</w:t>
+            </w:r>
+            <w:r>
+              <w:rPr>
+                <w:rFonts w:ascii="Arial" w:hAnsi="Arial" w:cs="Arial"/>
+                <w:sz w:val="20"/>
+                <w:szCs w:val="20"/>
+                <w:lang w:val="fi-FI"/>
+              </w:rPr>
+              <w:t>}</w:t>
+            </w:r>
+          </w:p>
+          <w:p>
+            <w:pPr>
+              <w:rPr>
+                <w:rFonts w:ascii="Arial" w:hAnsi="Arial" w:cs="Arial"/>
+                <w:sz w:val="20"/>
+                <w:szCs w:val="20"/>
+              </w:rPr>
+            </w:pPr>
+            <w:r>
+              <w:rPr>
+                <w:rFonts w:ascii="Arial" w:hAnsi="Arial" w:cs="Arial"/>
+                <w:sz w:val="20"/>
+                <w:szCs w:val="20"/>
+              </w:rPr>
+              <w:t>${</w:t>
+            </w:r>
+            <w:proofErr w:type="spellStart"/>
+            <w:r>
+              <w:rPr>
+                <w:rFonts w:ascii="Arial" w:hAnsi="Arial" w:cs="Arial"/>
+                <w:sz w:val="20"/>
+                <w:szCs w:val="20"/>
+              </w:rPr>
+              <w:t>analisis</w:t>
+            </w:r>
+            <w:proofErr w:type="spellEnd"/>
+            <w:r>
+              <w:rPr>
+                <w:rFonts w:ascii="Arial" w:hAnsi="Arial" w:cs="Arial"/>
+                <w:sz w:val="20"/>
+                <w:szCs w:val="20"/>
+              </w:rPr>
+              <w:t>}</w:t>
+            </w:r>
+          </w:p>
+        </w:tc>
+      </w:tr>
+      <w:tr>
+        <w:trPr>
+          <w:trHeight w:val="20"/>
+        </w:trPr>
+        <w:tc>
+          <w:tcPr>
+            <w:tcW w:w="10102" w:type="dxa"/>
+            <w:gridSpan w:val="3"/>
+            <w:tcBorders>
+              <w:top w:val="nil"/>
+              <w:bottom w:val="single" w:sz="4" w:space="0" w:color="auto"/>
+            </w:tcBorders>
+            <w:shd w:val="clear" w:color="auto" w:fill="auto"/>
+            <w:vAlign w:val="center"/>
+          </w:tcPr>
+          <w:p>
+            <w:pPr>
+              <w:rPr>
+                <w:rFonts w:ascii="Arial" w:hAnsi="Arial" w:cs="Arial"/>
+                <w:sz w:val="2"/>
+                <w:szCs w:val="2"/>
+                <w:lang w:val="fi-FI"/>
+              </w:rPr>
+            </w:pPr>
+          </w:p>
+        </w:tc>
+      </w:tr>
+      <w:tr>
+        <w:tc>
+          <w:tcPr>
+            <w:tcW w:w="10102" w:type="dxa"/>
+            <w:gridSpan w:val="3"/>
+            <w:tcBorders>
+              <w:top w:val="single" w:sz="4" w:space="0" w:color="auto"/>
+              <w:bottom w:val="single" w:sz="4" w:space="0" w:color="auto"/>
+            </w:tcBorders>
+            <w:shd w:val="clear" w:color="auto" w:fill="BDD6EE" w:themeFill="accent1" w:themeFillTint="66"/>
+          </w:tcPr>
+          <w:p>
+            <w:pPr>
+              <w:rPr>
+                <w:rFonts w:ascii="Arial" w:hAnsi="Arial" w:cs="Arial"/>
+                <w:sz w:val="20"/>
+                <w:szCs w:val="20"/>
+              </w:rPr>
+            </w:pPr>
+            <w:proofErr w:type="spellStart"/>
+            <w:r>
+              <w:rPr>
+                <w:rFonts w:ascii="Arial" w:hAnsi="Arial" w:cs="Arial"/>
+                <w:sz w:val="20"/>
+                <w:szCs w:val="20"/>
+              </w:rPr>
+              <w:t>Akibat</w:t>
+            </w:r>
+            <w:proofErr w:type="spellEnd"/>
+            <w:r>
+              <w:rPr>
+                <w:rFonts w:ascii="Arial" w:hAnsi="Arial" w:cs="Arial"/>
+                <w:sz w:val="20"/>
+                <w:szCs w:val="20"/>
+              </w:rPr>
+              <w:t xml:space="preserve"> </w:t>
+            </w:r>
+          </w:p>
+        </w:tc>
+      </w:tr>
+      <w:tr>
+        <w:trPr>
+          <w:trHeight w:val="20"/>
+        </w:trPr>
+        <w:tc>
+          <w:tcPr>
+            <w:tcW w:w="10102" w:type="dxa"/>
+            <w:gridSpan w:val="3"/>
+            <w:tcBorders>
+              <w:top w:val="single" w:sz="4" w:space="0" w:color="auto"/>
+              <w:bottom w:val="nil"/>
+            </w:tcBorders>
+            <w:shd w:val="clear" w:color="auto" w:fill="auto"/>
+            <w:vAlign w:val="center"/>
+          </w:tcPr>
+          <w:p>
+            <w:pPr>
+              <w:rPr>
+                <w:rFonts w:ascii="Arial" w:hAnsi="Arial" w:cs="Arial"/>
+                <w:sz w:val="2"/>
+                <w:szCs w:val="2"/>
+                <w:lang w:val="fi-FI"/>
+              </w:rPr>
+            </w:pPr>
+          </w:p>
+        </w:tc>
+      </w:tr>
+      <w:tr>
+        <w:trPr>
+          <w:trHeight w:val="340"/>
+        </w:trPr>
+        <w:tc>
+          <w:tcPr>
+            <w:tcW w:w="10102" w:type="dxa"/>
+            <w:gridSpan w:val="3"/>
+            <w:tcBorders>
+              <w:top w:val="nil"/>
+              <w:bottom w:val="nil"/>
+            </w:tcBorders>
+            <w:shd w:val="clear" w:color="auto" w:fill="auto"/>
+            <w:vAlign w:val="center"/>
+          </w:tcPr>
+          <w:p>
+            <w:pPr>
+              <w:rPr>
+                <w:rFonts w:ascii="Arial" w:hAnsi="Arial" w:cs="Arial"/>
+                <w:sz w:val="20"/>
+                <w:szCs w:val="20"/>
+                <w:lang w:val="fi-FI"/>
+              </w:rPr>
+            </w:pPr>
+            <w:r>
+              <w:rPr>
+                <w:rFonts w:ascii="Arial" w:hAnsi="Arial" w:cs="Arial"/>
+                <w:sz w:val="20"/>
+                <w:szCs w:val="20"/>
+                <w:lang w:val="fi-FI"/>
+              </w:rPr>
+              <w:t>${noAkibat}</w:t>
+            </w:r>
+            <w:r>
+              <w:rPr>
+                <w:rFonts w:ascii="Arial" w:hAnsi="Arial" w:cs="Arial"/>
+                <w:sz w:val="20"/>
+                <w:szCs w:val="20"/>
+                <w:lang w:val="fi-FI"/>
+              </w:rPr>
+              <w:t>${kode</w:t>
+            </w:r>
+            <w:r>
+              <w:rPr>
+                <w:rFonts w:ascii="Arial" w:hAnsi="Arial" w:cs="Arial"/>
+                <w:sz w:val="20"/>
+                <w:szCs w:val="20"/>
+                <w:lang w:val="fi-FI"/>
+              </w:rPr>
+              <w:t>Akibat</w:t>
+            </w:r>
+            <w:r>
+              <w:rPr>
+                <w:rFonts w:ascii="Arial" w:hAnsi="Arial" w:cs="Arial"/>
+                <w:sz w:val="20"/>
+                <w:szCs w:val="20"/>
+                <w:lang w:val="fi-FI"/>
+              </w:rPr>
+              <w:t>}</w:t>
+            </w:r>
+          </w:p>
+          <w:p>
+            <w:pPr>
+              <w:rPr>
+                <w:rFonts w:ascii="Arial" w:hAnsi="Arial" w:cs="Arial"/>
+                <w:sz w:val="20"/>
+                <w:szCs w:val="20"/>
+              </w:rPr>
+            </w:pPr>
+            <w:r>
+              <w:rPr>
+                <w:rFonts w:ascii="Arial" w:hAnsi="Arial" w:cs="Arial"/>
+                <w:sz w:val="20"/>
+                <w:szCs w:val="20"/>
+              </w:rPr>
+              <w:t>${</w:t>
+            </w:r>
+            <w:proofErr w:type="spellStart"/>
+            <w:r>
+              <w:rPr>
+                <w:rFonts w:ascii="Arial" w:hAnsi="Arial" w:cs="Arial"/>
+                <w:sz w:val="20"/>
+                <w:szCs w:val="20"/>
+              </w:rPr>
+              <w:t>akibat</w:t>
+            </w:r>
+            <w:proofErr w:type="spellEnd"/>
+            <w:r>
+              <w:rPr>
+                <w:rFonts w:ascii="Arial" w:hAnsi="Arial" w:cs="Arial"/>
+                <w:sz w:val="20"/>
+                <w:szCs w:val="20"/>
+              </w:rPr>
+              <w:t>}</w:t>
+            </w:r>
+          </w:p>
+        </w:tc>
+      </w:tr>
+      <w:tr>
+        <w:trPr>
+          <w:trHeight w:val="20"/>
+        </w:trPr>
+        <w:tc>
+          <w:tcPr>
+            <w:tcW w:w="10102" w:type="dxa"/>
+            <w:gridSpan w:val="3"/>
+            <w:tcBorders>
+              <w:top w:val="nil"/>
+              <w:bottom w:val="single" w:sz="4" w:space="0" w:color="auto"/>
+            </w:tcBorders>
+            <w:shd w:val="clear" w:color="auto" w:fill="auto"/>
+            <w:vAlign w:val="center"/>
+          </w:tcPr>
+          <w:p>
+            <w:pPr>
+              <w:rPr>
+                <w:rFonts w:ascii="Arial" w:hAnsi="Arial" w:cs="Arial"/>
+                <w:sz w:val="2"/>
+                <w:szCs w:val="2"/>
+                <w:lang w:val="fi-FI"/>
+              </w:rPr>
+            </w:pPr>
+          </w:p>
+        </w:tc>
+      </w:tr>
+      <w:tr>
+        <w:tc>
+          <w:tcPr>
+            <w:tcW w:w="4241" w:type="dxa"/>
+            <w:tcBorders>
+              <w:top w:val="single" w:sz="4" w:space="0" w:color="auto"/>
+            </w:tcBorders>
+            <w:shd w:val="clear" w:color="auto" w:fill="BDD6EE" w:themeFill="accent1" w:themeFillTint="66"/>
+          </w:tcPr>
+          <w:p>
+            <w:pPr>
+              <w:rPr>
+                <w:rFonts w:ascii="Arial" w:hAnsi="Arial" w:cs="Arial"/>
+                <w:sz w:val="20"/>
+                <w:szCs w:val="20"/>
+              </w:rPr>
+            </w:pPr>
+            <w:proofErr w:type="spellStart"/>
+            <w:r>
+              <w:rPr>
+                <w:rFonts w:ascii="Arial" w:hAnsi="Arial" w:cs="Arial"/>
+                <w:sz w:val="20"/>
+                <w:szCs w:val="20"/>
+              </w:rPr>
+              <w:t>Ketua</w:t>
+            </w:r>
+            <w:proofErr w:type="spellEnd"/>
+            <w:r>
+              <w:rPr>
+                <w:rFonts w:ascii="Arial" w:hAnsi="Arial" w:cs="Arial"/>
+                <w:sz w:val="20"/>
+                <w:szCs w:val="20"/>
+              </w:rPr>
+              <w:t xml:space="preserve"> Auditor</w:t>
+            </w:r>
+          </w:p>
+        </w:tc>
+        <w:tc>
+          <w:tcPr>
+            <w:tcW w:w="3108" w:type="dxa"/>
+            <w:tcBorders>
+              <w:top w:val="single" w:sz="4" w:space="0" w:color="auto"/>
+            </w:tcBorders>
+            <w:shd w:val="clear" w:color="auto" w:fill="BDD6EE" w:themeFill="accent1" w:themeFillTint="66"/>
+          </w:tcPr>
+          <w:p>
+            <w:pPr>
+              <w:rPr>
+                <w:rFonts w:ascii="Arial" w:hAnsi="Arial" w:cs="Arial"/>
+                <w:sz w:val="20"/>
+                <w:szCs w:val="20"/>
+              </w:rPr>
+            </w:pPr>
+            <w:r>
+              <w:rPr>
+                <w:rFonts w:ascii="Arial" w:hAnsi="Arial" w:cs="Arial"/>
+                <w:sz w:val="20"/>
+                <w:szCs w:val="20"/>
+              </w:rPr>
+              <w:t>Tanda Tangan</w:t>
+            </w:r>
+          </w:p>
+        </w:tc>
+        <w:tc>
+          <w:tcPr>
+            <w:tcW w:w="2753" w:type="dxa"/>
+            <w:tcBorders>
+              <w:top w:val="single" w:sz="4" w:space="0" w:color="auto"/>
+            </w:tcBorders>
+            <w:shd w:val="clear" w:color="auto" w:fill="BDD6EE" w:themeFill="accent1" w:themeFillTint="66"/>
+          </w:tcPr>
+          <w:p>
+            <w:pPr>
+              <w:rPr>
+                <w:rFonts w:ascii="Arial" w:hAnsi="Arial" w:cs="Arial"/>
+                <w:sz w:val="20"/>
+                <w:szCs w:val="20"/>
+              </w:rPr>
+            </w:pPr>
+            <w:proofErr w:type="spellStart"/>
+            <w:r>
+              <w:rPr>
+                <w:rFonts w:ascii="Arial" w:hAnsi="Arial" w:cs="Arial"/>
+                <w:sz w:val="20"/>
+                <w:szCs w:val="20"/>
+              </w:rPr>
+              <w:t>Tanggal</w:t>
+            </w:r>
+            <w:proofErr w:type="spellEnd"/>
+            <w:r>
+              <w:rPr>
+                <w:rFonts w:ascii="Arial" w:hAnsi="Arial" w:cs="Arial"/>
+                <w:sz w:val="20"/>
+                <w:szCs w:val="20"/>
+              </w:rPr>
+              <w:t xml:space="preserve"> Audit</w:t>
+            </w:r>
+          </w:p>
+        </w:tc>
+      </w:tr>
+      <w:tr>
+        <w:tc>
+          <w:tcPr>
+            <w:tcW w:w="4241" w:type="dxa"/>
+            <w:shd w:val="clear" w:color="auto" w:fill="auto"/>
+            <w:vAlign w:val="center"/>
+          </w:tcPr>
+          <w:p>
+            <w:pPr>
+              <w:jc w:val="center"/>
+              <w:rPr>
+                <w:rFonts w:ascii="Arial" w:hAnsi="Arial" w:cs="Arial"/>
+                <w:sz w:val="20"/>
+                <w:szCs w:val="20"/>
+              </w:rPr>
+            </w:pPr>
+          </w:p>
+          <w:p>
+            <w:pPr>
+              <w:jc w:val="center"/>
+              <w:rPr>
+                <w:rFonts w:ascii="Arial" w:hAnsi="Arial" w:cs="Arial"/>
+                <w:sz w:val="20"/>
+                <w:szCs w:val="20"/>
+              </w:rPr>
+            </w:pPr>
+            <w:r>
+              <w:rPr>
+                <w:rFonts w:ascii="Arial" w:hAnsi="Arial" w:cs="Arial"/>
+                <w:sz w:val="20"/>
+                <w:szCs w:val="20"/>
+              </w:rPr>
+              <w:t>${auditor#1}</w:t>
+            </w:r>
+          </w:p>
+          <w:p>
+            <w:pPr>
+              <w:jc w:val="center"/>
+              <w:rPr>
+                <w:rFonts w:ascii="Arial" w:hAnsi="Arial" w:cs="Arial"/>
+                <w:sz w:val="20"/>
+                <w:szCs w:val="20"/>
+              </w:rPr>
+            </w:pPr>
+          </w:p>
+        </w:tc>
+        <w:tc>
+          <w:tcPr>
+            <w:tcW w:w="3108" w:type="dxa"/>
+            <w:shd w:val="clear" w:color="auto" w:fill="auto"/>
+            <w:vAlign w:val="center"/>
+          </w:tcPr>
+          <w:p>
+            <w:pPr>
+              <w:jc w:val="center"/>
+              <w:rPr>
+                <w:rFonts w:ascii="Arial" w:hAnsi="Arial" w:cs="Arial"/>
+                <w:sz w:val="20"/>
+                <w:szCs w:val="20"/>
+              </w:rPr>
+            </w:pPr>
+            <w:r>
+              <w:rPr>
+                <w:rFonts w:ascii="Arial" w:hAnsi="Arial" w:cs="Arial"/>
+                <w:sz w:val="20"/>
+                <w:szCs w:val="20"/>
+              </w:rPr>
+              <w:t>${image</w:t>
+            </w:r>
+            <w:r>
+              <w:rPr>
+                <w:rFonts w:ascii="Arial" w:hAnsi="Arial" w:cs="Arial"/>
+                <w:sz w:val="20"/>
+                <w:szCs w:val="20"/>
+              </w:rPr>
+              <w:t>_auditor</w:t>
+            </w:r>
+            <w:r>
+              <w:rPr>
+                <w:rFonts w:ascii="Arial" w:hAnsi="Arial" w:cs="Arial"/>
+                <w:sz w:val="20"/>
+                <w:szCs w:val="20"/>
+              </w:rPr>
+              <w:t>#1}</w:t>
+            </w:r>
+          </w:p>
+        </w:tc>
+        <w:tc>
+          <w:tcPr>
+            <w:tcW w:w="2753" w:type="dxa"/>
+            <w:shd w:val="clear" w:color="auto" w:fill="auto"/>
+            <w:vAlign w:val="center"/>
+          </w:tcPr>
+          <w:p>
+            <w:pPr>
+              <w:jc w:val="center"/>
+              <w:rPr>
+                <w:rFonts w:ascii="Arial" w:hAnsi="Arial" w:cs="Arial"/>
+                <w:sz w:val="20"/>
+                <w:szCs w:val="20"/>
+              </w:rPr>
+            </w:pPr>
+          </w:p>
+          <w:p>
+            <w:pPr>
+              <w:jc w:val="center"/>
+              <w:rPr>
+                <w:rFonts w:ascii="Arial" w:hAnsi="Arial" w:cs="Arial"/>
+                <w:sz w:val="20"/>
+                <w:szCs w:val="20"/>
+              </w:rPr>
+            </w:pPr>
+            <w:r>
+              <w:rPr>
+                <w:rFonts w:ascii="Arial" w:hAnsi="Arial" w:cs="Arial"/>
+                <w:sz w:val="20"/>
+                <w:szCs w:val="20"/>
+              </w:rPr>
+              <w:t>${date}</w:t>
+            </w:r>
+          </w:p>
+        </w:tc>
+      </w:tr>
+    </w:tbl>
+    <w:p>
+      <w:pPr>
+        <w:spacing w:after="0" w:line="240" w:lineRule="auto"/>
         <w:rPr>
           <w:rFonts w:ascii="Arial" w:hAnsi="Arial" w:cs="Arial"/>
           <w:b/>
@@ -4687,7 +4684,7 @@
   <w:style w:type="paragraph" w:default="1" w:styleId="Normal">
     <w:name w:val="Normal"/>
     <w:qFormat/>
-    <w:rsid w:val="00BD7032"/>
+    <w:rsid w:val="00500E25"/>
   </w:style>
   <w:style w:type="character" w:default="1" w:styleId="DefaultParagraphFont">
     <w:name w:val="Default Paragraph Font"/>

</xml_diff>